<commit_message>
fix(checkpoint-2): do layout bao cao bang metrics font that + tu validate khong tran
- src/build_checkpoint_report.py:
  - do chieu cao/so dong bang metrics that cua font (Pillow doc TTF Calibri/Consolas)
    -> wrap giong het PowerPoint, tu thu nho cu chung khi vuot khung
  - fill theo 'khung' (card) cua template: tieu de + than; kiem tra tran bang + kiem tra chong
  - noi khoi 'PROVENANCE'/'BLOCKER' + 'SCALE' de du chua nho
  - tham chieu TAG (khong phu thuoc HEAD) -> sinh lai bao cao cho ket qua giong het nhau
  - validate() tra exit code != 0 neu con tran/chong/thieu noi dung
- src/build_checkpoint_brief.py:
  - dieu 4 dong EXIT TICKET ngay tai cho (thay duong '____' cua mau) thay vi them muc rieng
  - them bang doi chieu rubric -> evidence + validate
- docs/*.pptx|docx: sinh lai theo layout moi

Khong sua 1 byte nao cua raw CSV 8,59 GB.
</commit_message>
<xml_diff>
--- a/docs/Checkpoint2_Brief_Filled.docx
+++ b/docs/Checkpoint2_Brief_Filled.docx
@@ -1626,7 +1626,7 @@
               <w:rPr>
                 <w:sz w:val="20"/>
               </w:rPr>
-              <w:t>2d80b55 · tag checkpoint-2 (445621b) · nhánh main · repo: bigdata-project</w:t>
+              <w:t>tag checkpoint-2 (be67019) · nhánh main · repo: bigdata-project</w:t>
             </w:r>
           </w:p>
         </w:tc>
@@ -1810,6 +1810,8 @@
               </w:rPr>
               <w:t>Manifest: data/raw/youtube_trending/ingest_date=2026-10-20/run_20261020T143013Z/manifest.json</w:t>
               <w:br/>
+              <w:t xml:space="preserve">  (records=6094047 đếm chuẩn RFC4180, amendments[] ghi lại mọi thay đổi metadata)</w:t>
+              <w:br/>
               <w:t>Log: logs/env_check.txt · logs/ingest.log · logs/transform.log</w:t>
               <w:br/>
               <w:t>(cả manifest + log đã commit vào git → GV clone repo là thấy bằng chứng)</w:t>
@@ -1855,6 +1857,8 @@
               <w:t xml:space="preserve">  • hash khác → run_id MỚI (append, không overwrite) | nguồn hỏng → fail-fast</w:t>
               <w:br/>
               <w:t xml:space="preserve">  • ép khác: --on-duplicate new-run | fail</w:t>
+              <w:br/>
+              <w:t>Đã chạy thật 3 lần liên tiếp trên file 8,59 GB → raw vẫn đúng 1 run.</w:t>
             </w:r>
           </w:p>
         </w:tc>
@@ -1954,7 +1958,11 @@
     </w:p>
     <w:p>
       <w:r>
-        <w:t xml:space="preserve">  __________________________________________________________________________</w:t>
+        <w:t>python src\env_check.py</w:t>
+        <w:br/>
+        <w:t>→ in ra Spark version + phép tính Spark (Count 1.000.000) + RESULT: PASS, exit code 0.</w:t>
+        <w:br/>
+        <w:t>Output được append vào logs/env_check.txt (đã commit vào git).</w:t>
       </w:r>
     </w:p>
     <w:p>
@@ -1967,7 +1975,13 @@
     </w:p>
     <w:p>
       <w:r>
-        <w:t xml:space="preserve">  __________________________________________________________________________</w:t>
+        <w:t>Ghi trong metadata/README.md + manifest.json của từng lần ingest:</w:t>
+        <w:br/>
+        <w:t xml:space="preserve">  dataset + URL nguồn + license (ODC-By) + ngày snapshot tải (2026-10-20)</w:t>
+        <w:br/>
+        <w:t xml:space="preserve">  + ingested_at_utc + SHA-256 + bytes + số record (đếm chuẩn RFC4180).</w:t>
+        <w:br/>
+        <w:t>Nguồn tự cập nhật hằng ngày → mỗi lần ingest là một run_id riêng, không ghi đè.</w:t>
       </w:r>
     </w:p>
     <w:p>
@@ -1980,7 +1994,19 @@
     </w:p>
     <w:p>
       <w:r>
-        <w:t xml:space="preserve">  __________________________________________________________________________</w:t>
+        <w:t>Mặc định là skip-if-same-hash (idempotent):</w:t>
+        <w:br/>
+        <w:t xml:space="preserve">  lần 1  → tạo run_&lt;UTC_TIMESTAMP&gt;/ + copy file + ghi manifest.json</w:t>
+        <w:br/>
+        <w:t xml:space="preserve">  lần 2,3 → SHA-256 trùng → SKIP, KHÔNG tạo run mới, raw storage giữ nguyên</w:t>
+        <w:br/>
+        <w:t xml:space="preserve">            (log ghi rõ 'duplicate_skip → raw storage KHÔNG thay đổi')</w:t>
+        <w:br/>
+        <w:t xml:space="preserve">  file mới / version mới (hash khác) → tạo run_id mới (append, không overwrite)</w:t>
+        <w:br/>
+        <w:t xml:space="preserve">  nguồn hỏng (quality gate fail) → fail-fast (exit 1), không tạo 'raw' giả</w:t>
+        <w:br/>
+        <w:t>Có thể ép hành vi khác: --on-duplicate new-run (luôn tạo run) | fail (thoát lỗi).</w:t>
       </w:r>
     </w:p>
     <w:p>
@@ -1993,109 +2019,11 @@
     </w:p>
     <w:p>
       <w:r>
-        <w:t xml:space="preserve">  __________________________________________________________________________</w:t>
-      </w:r>
-    </w:p>
-    <w:p/>
-    <w:p>
-      <w:r>
-        <w:rPr>
-          <w:b/>
-          <w:sz w:val="26"/>
-        </w:rPr>
-        <w:t>EXIT TICKET – TRẢ LỜI CỦA NHÓM</w:t>
-      </w:r>
-    </w:p>
-    <w:p>
-      <w:r>
-        <w:rPr>
-          <w:b/>
-          <w:sz w:val="22"/>
-        </w:rPr>
-        <w:t>Câu 1 – Một lệnh duy nhất để kiểm tra environment của nhóm là gì?</w:t>
-      </w:r>
-    </w:p>
-    <w:p>
-      <w:r>
-        <w:rPr>
-          <w:sz w:val="20"/>
-        </w:rPr>
-        <w:t>python src\env_check.py</w:t>
-        <w:br/>
-        <w:t>→ in ra Spark version + phép tính Spark (Count 1.000.000) + RESULT: PASS, exit code 0.</w:t>
-        <w:br/>
-        <w:t>Output được append vào logs/env_check.txt (đã commit vào git).</w:t>
-      </w:r>
-    </w:p>
-    <w:p>
-      <w:r>
-        <w:rPr>
-          <w:b/>
-          <w:sz w:val="22"/>
-        </w:rPr>
-        <w:t>Câu 2 – Nhóm xác định version/snapshot dữ liệu bằng cách nào?</w:t>
-      </w:r>
-    </w:p>
-    <w:p>
-      <w:r>
-        <w:rPr>
-          <w:sz w:val="20"/>
-        </w:rPr>
-        <w:t>Ghi trong metadata/README.md + manifest.json của từng lần ingest:</w:t>
-        <w:br/>
-        <w:t xml:space="preserve">  dataset + URL nguồn + license (ODC-By) + ngày snapshot tải (2026-10-20)</w:t>
-        <w:br/>
-        <w:t xml:space="preserve">  + ingested_at_utc + SHA-256 của file + kích thước bytes + số record (đếm RFC4180).</w:t>
-        <w:br/>
-        <w:t>Nguồn tự cập nhật hằng ngày → mỗi lần ingest là một run_id riêng, không ghi đè.</w:t>
-      </w:r>
-    </w:p>
-    <w:p>
-      <w:r>
-        <w:rPr>
-          <w:b/>
-          <w:sz w:val="22"/>
-        </w:rPr>
-        <w:t>Câu 3 – Nếu chạy ingestion 3 lần, raw storage thay đổi thế nào?</w:t>
-      </w:r>
-    </w:p>
-    <w:p>
-      <w:r>
-        <w:rPr>
-          <w:sz w:val="20"/>
-        </w:rPr>
-        <w:t>Mặc định là skip-if-same-hash (idempotent):</w:t>
-        <w:br/>
-        <w:t xml:space="preserve">  lần 1  → tạo run_&lt;UTC_TIMESTAMP&gt;/ + copy file + ghi manifest.json</w:t>
-        <w:br/>
-        <w:t xml:space="preserve">  lần 2,3 → SHA-256 trùng → SKIP, KHÔNG tạo run mới, raw storage giữ nguyên</w:t>
-        <w:br/>
-        <w:t xml:space="preserve">            (log ghi rõ 'duplicate_skip → raw storage KHÔNG thay đổi')</w:t>
-        <w:br/>
-        <w:t xml:space="preserve">  file mới / version mới (hash khác) → tạo run_id mới (append, không overwrite)</w:t>
-        <w:br/>
-        <w:t xml:space="preserve">  nguồn hỏng (quality gate fail) → fail-fast, không tạo 'raw' giả</w:t>
-        <w:br/>
-        <w:t>Có thể ép hành vi khác: --on-duplicate new-run (luôn tạo run) | fail (thoát lỗi).</w:t>
-      </w:r>
-    </w:p>
-    <w:p>
-      <w:r>
-        <w:rPr>
-          <w:b/>
-          <w:sz w:val="22"/>
-        </w:rPr>
-        <w:t>Câu 4 – Rủi ro lớn nhất trước Buổi 7 là gì?</w:t>
-      </w:r>
-    </w:p>
-    <w:p>
-      <w:r>
-        <w:rPr>
-          <w:sz w:val="20"/>
-        </w:rPr>
         <w:t>Rủi ro đã xảy ra &amp; đã xử lý: schema nguồn Plan B khác đề cương (không có category_id,</w:t>
         <w:br/>
-        <w:t>description nhiều dòng khiến Spark đếm sai 17 lần) → adapter SRC_MAP + split_csv.py.</w:t>
+        <w:t>description nhiều dòng khiến Spark đếm sai 17 lần) → adapter SRC_MAP + split_csv.py</w:t>
+        <w:br/>
+        <w:t>+ verify_raw_records.py (đếm lại 6.094.047 record, khớp manifest).</w:t>
         <w:br/>
         <w:t>Rủi ro còn lại: file 8,59 GB mỗi snapshot + nguồn cập nhật hằng ngày → phải chạy</w:t>
         <w:br/>
@@ -2287,7 +2215,7 @@
               <w:rPr>
                 <w:sz w:val="19"/>
               </w:rPr>
-              <w:t>README.md · tag checkpoint-2 (445621b) · docs/Checkpoint2_Report_*.pptx</w:t>
+              <w:t>README.md · tag checkpoint-2 (be67019) · docs/Checkpoint2_Report_*.pptx · docs/Checkpoint2_Brief_Filled.docx</w:t>
             </w:r>
           </w:p>
         </w:tc>
@@ -2315,7 +2243,7 @@
               <w:rPr>
                 <w:sz w:val="19"/>
               </w:rPr>
-              <w:t>Roles + trade-off ghi ở README §1-11 và docs/checkpoint2_slides_noidung.md</w:t>
+              <w:t>Roles + trade-off ghi ở README §1-9b và docs/checkpoint2_slides_noidung.md</w:t>
             </w:r>
           </w:p>
         </w:tc>

</xml_diff>

<commit_message>
docs(checkpoint-2): dong bo commit hash cua tag checkpoint-2 trong noi dung 6 slide
</commit_message>
<xml_diff>
--- a/docs/Checkpoint2_Brief_Filled.docx
+++ b/docs/Checkpoint2_Brief_Filled.docx
@@ -1626,7 +1626,7 @@
               <w:rPr>
                 <w:sz w:val="20"/>
               </w:rPr>
-              <w:t>tag checkpoint-2 (be67019) · nhánh main · repo: bigdata-project</w:t>
+              <w:t>tag checkpoint-2 (1cd9bca) · nhánh main · repo: bigdata-project</w:t>
             </w:r>
           </w:p>
         </w:tc>
@@ -2215,7 +2215,7 @@
               <w:rPr>
                 <w:sz w:val="19"/>
               </w:rPr>
-              <w:t>README.md · tag checkpoint-2 (be67019) · docs/Checkpoint2_Report_*.pptx · docs/Checkpoint2_Brief_Filled.docx</w:t>
+              <w:t>README.md · tag checkpoint-2 (1cd9bca) · docs/Checkpoint2_Report_*.pptx · docs/Checkpoint2_Brief_Filled.docx</w:t>
             </w:r>
           </w:p>
         </w:tc>

</xml_diff>

<commit_message>
refactor(checkpoint-2): bao cao tham chieu TAG (khong phu thuoc HEAD) de sinh lai idempotent
- PPTX/DOCX chi ghi 'tag checkpoint-2' + lenh 'git log -1 checkpoint-2'
  -> tag co the tro toi commit cuoi cung ma noi dung bao cao van dung
- validate() bo phu thuoc commit hash, giu kiem tra noi dung bat buoc
- docs/checkpoint2_slides_noidung.md: cung dung tag thay vi commit hard-code
</commit_message>
<xml_diff>
--- a/docs/Checkpoint2_Brief_Filled.docx
+++ b/docs/Checkpoint2_Brief_Filled.docx
@@ -1626,7 +1626,7 @@
               <w:rPr>
                 <w:sz w:val="20"/>
               </w:rPr>
-              <w:t>tag checkpoint-2 (1cd9bca) · nhánh main · repo: bigdata-project</w:t>
+              <w:t>tag checkpoint-2 · nhánh main · repo: bigdata-project (git log -1 checkpoint-2)</w:t>
             </w:r>
           </w:p>
         </w:tc>
@@ -2215,7 +2215,7 @@
               <w:rPr>
                 <w:sz w:val="19"/>
               </w:rPr>
-              <w:t>README.md · tag checkpoint-2 (1cd9bca) · docs/Checkpoint2_Report_*.pptx · docs/Checkpoint2_Brief_Filled.docx</w:t>
+              <w:t>README.md · tag checkpoint-2 · docs/Checkpoint2_Report_*.pptx · docs/Checkpoint2_Brief_Filled.docx</w:t>
             </w:r>
           </w:p>
         </w:tc>

</xml_diff>